<commit_message>
Enhance GARCH(1,1) model with persistence/mix reparametrization
- Introduced `persistence_max` parameter to enforce a hard upper bound on the sum of alpha_hat and beta_hat, ensuring stationarity is a structural guarantee.
- Modified the initialization of `persistence_raw` and `mix_raw` to utilize the new reparametrization approach.
- Updated the calculation of `alpha_hat` and `beta_hat` to reflect the changes in the forget gate's trainability.
- Adjusted the model's documentation to include the new `persistence_max` parameter and its implications for model stability.
</commit_message>
<xml_diff>
--- a/outputs/tables/Table10_Encompassing.docx
+++ b/outputs/tables/Table10_Encompassing.docx
@@ -240,7 +240,7 @@
                 <w:rFonts w:ascii="Times New Roman" w:hAnsi="Times New Roman"/>
                 <w:sz w:val="20"/>
               </w:rPr>
-              <w:t>0.801</w:t>
+              <w:t>0.989</w:t>
             </w:r>
           </w:p>
         </w:tc>
@@ -268,7 +268,7 @@
                 <w:rFonts w:ascii="Times New Roman" w:hAnsi="Times New Roman"/>
                 <w:sz w:val="20"/>
               </w:rPr>
-              <w:t>0.532</w:t>
+              <w:t>0.940*</w:t>
             </w:r>
           </w:p>
         </w:tc>
@@ -296,7 +296,7 @@
                 <w:rFonts w:ascii="Times New Roman" w:hAnsi="Times New Roman"/>
                 <w:sz w:val="20"/>
               </w:rPr>
-              <w:t>-4.710</w:t>
+              <w:t>0.350</w:t>
             </w:r>
           </w:p>
         </w:tc>
@@ -324,7 +324,7 @@
                 <w:rFonts w:ascii="Times New Roman" w:hAnsi="Times New Roman"/>
                 <w:sz w:val="20"/>
               </w:rPr>
-              <w:t>-58.030**</w:t>
+              <w:t>51.785**</w:t>
             </w:r>
           </w:p>
         </w:tc>
@@ -352,7 +352,7 @@
                 <w:rFonts w:ascii="Times New Roman" w:hAnsi="Times New Roman"/>
                 <w:sz w:val="20"/>
               </w:rPr>
-              <w:t>35.814**</w:t>
+              <w:t>38.310**</w:t>
             </w:r>
           </w:p>
         </w:tc>
@@ -380,7 +380,7 @@
                 <w:rFonts w:ascii="Times New Roman" w:hAnsi="Times New Roman"/>
                 <w:sz w:val="20"/>
               </w:rPr>
-              <w:t>4.844**</w:t>
+              <w:t>1.761***</w:t>
             </w:r>
           </w:p>
         </w:tc>
@@ -424,7 +424,7 @@
                 <w:rFonts w:ascii="Times New Roman" w:hAnsi="Times New Roman"/>
                 <w:sz w:val="20"/>
               </w:rPr>
-              <w:t>-0.484</w:t>
+              <w:t>1.160</w:t>
             </w:r>
           </w:p>
         </w:tc>
@@ -452,7 +452,7 @@
                 <w:rFonts w:ascii="Times New Roman" w:hAnsi="Times New Roman"/>
                 <w:sz w:val="20"/>
               </w:rPr>
-              <w:t>-0.393</w:t>
+              <w:t>1.144</w:t>
             </w:r>
           </w:p>
         </w:tc>
@@ -480,7 +480,7 @@
                 <w:rFonts w:ascii="Times New Roman" w:hAnsi="Times New Roman"/>
                 <w:sz w:val="20"/>
               </w:rPr>
-              <w:t>-2.394</w:t>
+              <w:t>-6.023</w:t>
             </w:r>
           </w:p>
         </w:tc>
@@ -508,7 +508,7 @@
                 <w:rFonts w:ascii="Times New Roman" w:hAnsi="Times New Roman"/>
                 <w:sz w:val="20"/>
               </w:rPr>
-              <w:t>-43.039</w:t>
+              <w:t>48.922</w:t>
             </w:r>
           </w:p>
         </w:tc>
@@ -536,7 +536,7 @@
                 <w:rFonts w:ascii="Times New Roman" w:hAnsi="Times New Roman"/>
                 <w:sz w:val="20"/>
               </w:rPr>
-              <w:t>25.934</w:t>
+              <w:t>37.362</w:t>
             </w:r>
           </w:p>
         </w:tc>
@@ -564,7 +564,7 @@
                 <w:rFonts w:ascii="Times New Roman" w:hAnsi="Times New Roman"/>
                 <w:sz w:val="20"/>
               </w:rPr>
-              <w:t>2.681</w:t>
+              <w:t>-0.000</w:t>
             </w:r>
           </w:p>
         </w:tc>
@@ -578,7 +578,7 @@
                 <w:rFonts w:ascii="Times New Roman" w:hAnsi="Times New Roman"/>
                 <w:sz w:val="20"/>
               </w:rPr>
-              <w:t>Benchmark suff.</w:t>
+              <w:t>Neither sig.</w:t>
             </w:r>
           </w:p>
         </w:tc>
@@ -608,7 +608,7 @@
                 <w:rFonts w:ascii="Times New Roman" w:hAnsi="Times New Roman"/>
                 <w:sz w:val="20"/>
               </w:rPr>
-              <w:t>—</w:t>
+              <w:t>3.649</w:t>
             </w:r>
           </w:p>
         </w:tc>
@@ -622,7 +622,7 @@
                 <w:rFonts w:ascii="Times New Roman" w:hAnsi="Times New Roman"/>
                 <w:sz w:val="20"/>
               </w:rPr>
-              <w:t>n/a</w:t>
+              <w:t>Neither sig.</w:t>
             </w:r>
           </w:p>
         </w:tc>
@@ -636,7 +636,7 @@
                 <w:rFonts w:ascii="Times New Roman" w:hAnsi="Times New Roman"/>
                 <w:sz w:val="20"/>
               </w:rPr>
-              <w:t>—</w:t>
+              <w:t>-3.184</w:t>
             </w:r>
           </w:p>
         </w:tc>
@@ -650,7 +650,7 @@
                 <w:rFonts w:ascii="Times New Roman" w:hAnsi="Times New Roman"/>
                 <w:sz w:val="20"/>
               </w:rPr>
-              <w:t>n/a</w:t>
+              <w:t>Benchmark suff.</w:t>
             </w:r>
           </w:p>
         </w:tc>
@@ -664,7 +664,7 @@
                 <w:rFonts w:ascii="Times New Roman" w:hAnsi="Times New Roman"/>
                 <w:sz w:val="20"/>
               </w:rPr>
-              <w:t>—</w:t>
+              <w:t>-1.459</w:t>
             </w:r>
           </w:p>
         </w:tc>
@@ -678,7 +678,7 @@
                 <w:rFonts w:ascii="Times New Roman" w:hAnsi="Times New Roman"/>
                 <w:sz w:val="20"/>
               </w:rPr>
-              <w:t>n/a</w:t>
+              <w:t>Neither sig.</w:t>
             </w:r>
           </w:p>
         </w:tc>
@@ -692,7 +692,7 @@
                 <w:rFonts w:ascii="Times New Roman" w:hAnsi="Times New Roman"/>
                 <w:sz w:val="20"/>
               </w:rPr>
-              <w:t>—</w:t>
+              <w:t>-0.656</w:t>
             </w:r>
           </w:p>
         </w:tc>
@@ -706,7 +706,7 @@
                 <w:rFonts w:ascii="Times New Roman" w:hAnsi="Times New Roman"/>
                 <w:sz w:val="20"/>
               </w:rPr>
-              <w:t>n/a</w:t>
+              <w:t>Neither sig.</w:t>
             </w:r>
           </w:p>
         </w:tc>

</xml_diff>

<commit_message>
Regenerate tables with full GOLD/OIL model roster
run_all_metrics/build_tables re-run after training the previously
missing models (CNN-LSTM, LSTM-Attention, LSTM-SSE, MSGARCH(1,1),
NN-GARCH, TCN, Transformer) for GOLD and OIL, so those two series now
report the same 17-model roster as the other four.

Co-Authored-By: Claude Sonnet 5 <noreply@anthropic.com>
</commit_message>
<xml_diff>
--- a/outputs/tables/Table10_Encompassing.docx
+++ b/outputs/tables/Table10_Encompassing.docx
@@ -226,7 +226,7 @@
                 <w:rFonts w:ascii="Times New Roman" w:hAnsi="Times New Roman"/>
                 <w:sz w:val="20"/>
               </w:rPr>
-              <w:t>LSTM-SSE-t-Student vs. ARCH(1)</w:t>
+              <w:t>GARCH-LSTM vs. ARCH(1)</w:t>
             </w:r>
           </w:p>
         </w:tc>
@@ -240,7 +240,7 @@
                 <w:rFonts w:ascii="Times New Roman" w:hAnsi="Times New Roman"/>
                 <w:sz w:val="20"/>
               </w:rPr>
-              <w:t>0.989</w:t>
+              <w:t>-0.016</w:t>
             </w:r>
           </w:p>
         </w:tc>
@@ -268,7 +268,7 @@
                 <w:rFonts w:ascii="Times New Roman" w:hAnsi="Times New Roman"/>
                 <w:sz w:val="20"/>
               </w:rPr>
-              <w:t>0.940*</w:t>
+              <w:t>0.721</w:t>
             </w:r>
           </w:p>
         </w:tc>
@@ -296,7 +296,7 @@
                 <w:rFonts w:ascii="Times New Roman" w:hAnsi="Times New Roman"/>
                 <w:sz w:val="20"/>
               </w:rPr>
-              <w:t>0.350</w:t>
+              <w:t>0.024</w:t>
             </w:r>
           </w:p>
         </w:tc>
@@ -324,7 +324,7 @@
                 <w:rFonts w:ascii="Times New Roman" w:hAnsi="Times New Roman"/>
                 <w:sz w:val="20"/>
               </w:rPr>
-              <w:t>51.785**</w:t>
+              <w:t>0.419</w:t>
             </w:r>
           </w:p>
         </w:tc>
@@ -338,7 +338,7 @@
                 <w:rFonts w:ascii="Times New Roman" w:hAnsi="Times New Roman"/>
                 <w:sz w:val="20"/>
               </w:rPr>
-              <w:t>Adds info</w:t>
+              <w:t>Neither sig.</w:t>
             </w:r>
           </w:p>
         </w:tc>
@@ -352,7 +352,7 @@
                 <w:rFonts w:ascii="Times New Roman" w:hAnsi="Times New Roman"/>
                 <w:sz w:val="20"/>
               </w:rPr>
-              <w:t>38.310**</w:t>
+              <w:t>0.969**</w:t>
             </w:r>
           </w:p>
         </w:tc>
@@ -366,7 +366,7 @@
                 <w:rFonts w:ascii="Times New Roman" w:hAnsi="Times New Roman"/>
                 <w:sz w:val="20"/>
               </w:rPr>
-              <w:t>Adds info</w:t>
+              <w:t>Both contribute</w:t>
             </w:r>
           </w:p>
         </w:tc>
@@ -380,7 +380,7 @@
                 <w:rFonts w:ascii="Times New Roman" w:hAnsi="Times New Roman"/>
                 <w:sz w:val="20"/>
               </w:rPr>
-              <w:t>1.761***</w:t>
+              <w:t>1.744***</w:t>
             </w:r>
           </w:p>
         </w:tc>
@@ -410,7 +410,7 @@
                 <w:rFonts w:ascii="Times New Roman" w:hAnsi="Times New Roman"/>
                 <w:sz w:val="20"/>
               </w:rPr>
-              <w:t>LSTM-SSE-t-Student vs. GARCH(1,1)</w:t>
+              <w:t>GARCH-LSTM vs. GARCH(1,1)</w:t>
             </w:r>
           </w:p>
         </w:tc>
@@ -424,7 +424,7 @@
                 <w:rFonts w:ascii="Times New Roman" w:hAnsi="Times New Roman"/>
                 <w:sz w:val="20"/>
               </w:rPr>
-              <w:t>1.160</w:t>
+              <w:t>0.937</w:t>
             </w:r>
           </w:p>
         </w:tc>
@@ -452,7 +452,35 @@
                 <w:rFonts w:ascii="Times New Roman" w:hAnsi="Times New Roman"/>
                 <w:sz w:val="20"/>
               </w:rPr>
-              <w:t>1.144</w:t>
+              <w:t>1.238***</w:t>
+            </w:r>
+          </w:p>
+        </w:tc>
+        <w:tc>
+          <w:tcPr>
+            <w:tcW w:type="dxa" w:w="665"/>
+          </w:tcPr>
+          <w:p>
+            <w:r>
+              <w:rPr>
+                <w:rFonts w:ascii="Times New Roman" w:hAnsi="Times New Roman"/>
+                <w:sz w:val="20"/>
+              </w:rPr>
+              <w:t>Adds info</w:t>
+            </w:r>
+          </w:p>
+        </w:tc>
+        <w:tc>
+          <w:tcPr>
+            <w:tcW w:type="dxa" w:w="665"/>
+          </w:tcPr>
+          <w:p>
+            <w:r>
+              <w:rPr>
+                <w:rFonts w:ascii="Times New Roman" w:hAnsi="Times New Roman"/>
+                <w:sz w:val="20"/>
+              </w:rPr>
+              <w:t>-0.507</w:t>
             </w:r>
           </w:p>
         </w:tc>
@@ -480,7 +508,7 @@
                 <w:rFonts w:ascii="Times New Roman" w:hAnsi="Times New Roman"/>
                 <w:sz w:val="20"/>
               </w:rPr>
-              <w:t>-6.023</w:t>
+              <w:t>-0.418</w:t>
             </w:r>
           </w:p>
         </w:tc>
@@ -508,7 +536,7 @@
                 <w:rFonts w:ascii="Times New Roman" w:hAnsi="Times New Roman"/>
                 <w:sz w:val="20"/>
               </w:rPr>
-              <w:t>48.922</w:t>
+              <w:t>0.494**</w:t>
             </w:r>
           </w:p>
         </w:tc>
@@ -522,7 +550,7 @@
                 <w:rFonts w:ascii="Times New Roman" w:hAnsi="Times New Roman"/>
                 <w:sz w:val="20"/>
               </w:rPr>
-              <w:t>Neither sig.</w:t>
+              <w:t>Adds info</w:t>
             </w:r>
           </w:p>
         </w:tc>
@@ -536,35 +564,7 @@
                 <w:rFonts w:ascii="Times New Roman" w:hAnsi="Times New Roman"/>
                 <w:sz w:val="20"/>
               </w:rPr>
-              <w:t>37.362</w:t>
-            </w:r>
-          </w:p>
-        </w:tc>
-        <w:tc>
-          <w:tcPr>
-            <w:tcW w:type="dxa" w:w="665"/>
-          </w:tcPr>
-          <w:p>
-            <w:r>
-              <w:rPr>
-                <w:rFonts w:ascii="Times New Roman" w:hAnsi="Times New Roman"/>
-                <w:sz w:val="20"/>
-              </w:rPr>
-              <w:t>Neither sig.</w:t>
-            </w:r>
-          </w:p>
-        </w:tc>
-        <w:tc>
-          <w:tcPr>
-            <w:tcW w:type="dxa" w:w="665"/>
-          </w:tcPr>
-          <w:p>
-            <w:r>
-              <w:rPr>
-                <w:rFonts w:ascii="Times New Roman" w:hAnsi="Times New Roman"/>
-                <w:sz w:val="20"/>
-              </w:rPr>
-              <w:t>-0.000</w:t>
+              <w:t>-0.707</w:t>
             </w:r>
           </w:p>
         </w:tc>
@@ -720,7 +720,7 @@
                 <w:rFonts w:ascii="Times New Roman" w:hAnsi="Times New Roman"/>
                 <w:sz w:val="20"/>
               </w:rPr>
-              <w:t>—</w:t>
+              <w:t>-0.008</w:t>
             </w:r>
           </w:p>
         </w:tc>
@@ -734,7 +734,7 @@
                 <w:rFonts w:ascii="Times New Roman" w:hAnsi="Times New Roman"/>
                 <w:sz w:val="20"/>
               </w:rPr>
-              <w:t>n/a</w:t>
+              <w:t>Benchmark suff.</w:t>
             </w:r>
           </w:p>
         </w:tc>
@@ -748,7 +748,7 @@
                 <w:rFonts w:ascii="Times New Roman" w:hAnsi="Times New Roman"/>
                 <w:sz w:val="20"/>
               </w:rPr>
-              <w:t>—</w:t>
+              <w:t>-0.049***</w:t>
             </w:r>
           </w:p>
         </w:tc>
@@ -762,7 +762,7 @@
                 <w:rFonts w:ascii="Times New Roman" w:hAnsi="Times New Roman"/>
                 <w:sz w:val="20"/>
               </w:rPr>
-              <w:t>n/a</w:t>
+              <w:t>Both contribute</w:t>
             </w:r>
           </w:p>
         </w:tc>

</xml_diff>

<commit_message>
Enhance table generation and diagnostics in reporting
- Updated build_tables.py to include Table 2: Residual diagnostics by model, enhancing the output with kurtosis, LBQ², and ARCH-LM tests.
- Modified LaTeX and DOCX table formatting for multi-index columns to improve readability and presentation.
- Added new tables (Table 10, Table 11, Table 12, Table 3, Table 4, Table 5, Table 6, Table 7, Table 8, Table 9) with updated data.
- Ensured binary files for tables reflect the latest changes in data and formatting.
</commit_message>
<xml_diff>
--- a/outputs/tables/Table10_Encompassing.docx
+++ b/outputs/tables/Table10_Encompassing.docx
@@ -36,6 +36,110 @@
           <w:tcPr>
             <w:tcW w:type="dxa" w:w="665"/>
           </w:tcPr>
+          <w:p/>
+        </w:tc>
+        <w:tc>
+          <w:tcPr>
+            <w:tcW w:type="dxa" w:w="1330"/>
+            <w:gridSpan w:val="2"/>
+          </w:tcPr>
+          <w:p>
+            <w:r>
+              <w:rPr>
+                <w:rFonts w:ascii="Times New Roman" w:hAnsi="Times New Roman"/>
+                <w:b/>
+                <w:sz w:val="20"/>
+              </w:rPr>
+              <w:t>BTC-USD</w:t>
+            </w:r>
+          </w:p>
+        </w:tc>
+        <w:tc>
+          <w:tcPr>
+            <w:tcW w:type="dxa" w:w="1330"/>
+            <w:gridSpan w:val="2"/>
+          </w:tcPr>
+          <w:p>
+            <w:r>
+              <w:rPr>
+                <w:rFonts w:ascii="Times New Roman" w:hAnsi="Times New Roman"/>
+                <w:b/>
+                <w:sz w:val="20"/>
+              </w:rPr>
+              <w:t>ETH-USD</w:t>
+            </w:r>
+          </w:p>
+        </w:tc>
+        <w:tc>
+          <w:tcPr>
+            <w:tcW w:type="dxa" w:w="1330"/>
+            <w:gridSpan w:val="2"/>
+          </w:tcPr>
+          <w:p>
+            <w:r>
+              <w:rPr>
+                <w:rFonts w:ascii="Times New Roman" w:hAnsi="Times New Roman"/>
+                <w:b/>
+                <w:sz w:val="20"/>
+              </w:rPr>
+              <w:t>DJIA</w:t>
+            </w:r>
+          </w:p>
+        </w:tc>
+        <w:tc>
+          <w:tcPr>
+            <w:tcW w:type="dxa" w:w="1330"/>
+            <w:gridSpan w:val="2"/>
+          </w:tcPr>
+          <w:p>
+            <w:r>
+              <w:rPr>
+                <w:rFonts w:ascii="Times New Roman" w:hAnsi="Times New Roman"/>
+                <w:b/>
+                <w:sz w:val="20"/>
+              </w:rPr>
+              <w:t>SP500</w:t>
+            </w:r>
+          </w:p>
+        </w:tc>
+        <w:tc>
+          <w:tcPr>
+            <w:tcW w:type="dxa" w:w="1330"/>
+            <w:gridSpan w:val="2"/>
+          </w:tcPr>
+          <w:p>
+            <w:r>
+              <w:rPr>
+                <w:rFonts w:ascii="Times New Roman" w:hAnsi="Times New Roman"/>
+                <w:b/>
+                <w:sz w:val="20"/>
+              </w:rPr>
+              <w:t>GOLD</w:t>
+            </w:r>
+          </w:p>
+        </w:tc>
+        <w:tc>
+          <w:tcPr>
+            <w:tcW w:type="dxa" w:w="1330"/>
+            <w:gridSpan w:val="2"/>
+          </w:tcPr>
+          <w:p>
+            <w:r>
+              <w:rPr>
+                <w:rFonts w:ascii="Times New Roman" w:hAnsi="Times New Roman"/>
+                <w:b/>
+                <w:sz w:val="20"/>
+              </w:rPr>
+              <w:t>OIL</w:t>
+            </w:r>
+          </w:p>
+        </w:tc>
+      </w:tr>
+      <w:tr>
+        <w:tc>
+          <w:tcPr>
+            <w:tcW w:type="dxa" w:w="665"/>
+          </w:tcPr>
           <w:p>
             <w:r>
               <w:rPr>
@@ -56,7 +160,7 @@
                 <w:rFonts w:ascii="Times New Roman" w:hAnsi="Times New Roman"/>
                 <w:sz w:val="20"/>
               </w:rPr>
-              <w:t>('BTC-USD', 'β_cand')</w:t>
+              <w:t>β_cand</w:t>
             </w:r>
           </w:p>
         </w:tc>
@@ -70,7 +174,7 @@
                 <w:rFonts w:ascii="Times New Roman" w:hAnsi="Times New Roman"/>
                 <w:sz w:val="20"/>
               </w:rPr>
-              <w:t>('BTC-USD', 'verdict')</w:t>
+              <w:t>verdict</w:t>
             </w:r>
           </w:p>
         </w:tc>
@@ -84,7 +188,7 @@
                 <w:rFonts w:ascii="Times New Roman" w:hAnsi="Times New Roman"/>
                 <w:sz w:val="20"/>
               </w:rPr>
-              <w:t>('ETH-USD', 'β_cand')</w:t>
+              <w:t>β_cand</w:t>
             </w:r>
           </w:p>
         </w:tc>
@@ -98,7 +202,7 @@
                 <w:rFonts w:ascii="Times New Roman" w:hAnsi="Times New Roman"/>
                 <w:sz w:val="20"/>
               </w:rPr>
-              <w:t>('ETH-USD', 'verdict')</w:t>
+              <w:t>verdict</w:t>
             </w:r>
           </w:p>
         </w:tc>
@@ -112,7 +216,7 @@
                 <w:rFonts w:ascii="Times New Roman" w:hAnsi="Times New Roman"/>
                 <w:sz w:val="20"/>
               </w:rPr>
-              <w:t>('DJIA', 'β_cand')</w:t>
+              <w:t>β_cand</w:t>
             </w:r>
           </w:p>
         </w:tc>
@@ -126,7 +230,7 @@
                 <w:rFonts w:ascii="Times New Roman" w:hAnsi="Times New Roman"/>
                 <w:sz w:val="20"/>
               </w:rPr>
-              <w:t>('DJIA', 'verdict')</w:t>
+              <w:t>verdict</w:t>
             </w:r>
           </w:p>
         </w:tc>
@@ -140,7 +244,7 @@
                 <w:rFonts w:ascii="Times New Roman" w:hAnsi="Times New Roman"/>
                 <w:sz w:val="20"/>
               </w:rPr>
-              <w:t>('SP500', 'β_cand')</w:t>
+              <w:t>β_cand</w:t>
             </w:r>
           </w:p>
         </w:tc>
@@ -154,7 +258,7 @@
                 <w:rFonts w:ascii="Times New Roman" w:hAnsi="Times New Roman"/>
                 <w:sz w:val="20"/>
               </w:rPr>
-              <w:t>('SP500', 'verdict')</w:t>
+              <w:t>verdict</w:t>
             </w:r>
           </w:p>
         </w:tc>
@@ -168,7 +272,7 @@
                 <w:rFonts w:ascii="Times New Roman" w:hAnsi="Times New Roman"/>
                 <w:sz w:val="20"/>
               </w:rPr>
-              <w:t>('GOLD', 'β_cand')</w:t>
+              <w:t>β_cand</w:t>
             </w:r>
           </w:p>
         </w:tc>
@@ -182,7 +286,7 @@
                 <w:rFonts w:ascii="Times New Roman" w:hAnsi="Times New Roman"/>
                 <w:sz w:val="20"/>
               </w:rPr>
-              <w:t>('GOLD', 'verdict')</w:t>
+              <w:t>verdict</w:t>
             </w:r>
           </w:p>
         </w:tc>
@@ -196,7 +300,7 @@
                 <w:rFonts w:ascii="Times New Roman" w:hAnsi="Times New Roman"/>
                 <w:sz w:val="20"/>
               </w:rPr>
-              <w:t>('OIL', 'β_cand')</w:t>
+              <w:t>β_cand</w:t>
             </w:r>
           </w:p>
         </w:tc>
@@ -210,7 +314,7 @@
                 <w:rFonts w:ascii="Times New Roman" w:hAnsi="Times New Roman"/>
                 <w:sz w:val="20"/>
               </w:rPr>
-              <w:t>('OIL', 'verdict')</w:t>
+              <w:t>verdict</w:t>
             </w:r>
           </w:p>
         </w:tc>

</xml_diff>

<commit_message>
Refactor reporting and table generation for GARCH-LSTM analysis
- Updated figure generation in build_figures.py to include new gate dynamics and forecast vs. observed panels for GARCH-LSTM.
- Introduced helper functions for computing and plotting gate dynamics and forecast vs. observed metrics.
- Enhanced display naming for GARCH-LSTM in build_tables.py, ensuring consistent labeling across tables and figures.
- Excluded ARCH-LSTM from all tables and figures as per user decision, with relevant comments added for clarity.
- Adjusted table generation logic to reflect the exclusion of ARCH-LSTM and ensure proper display of results for GARCH-LSTM.
</commit_message>
<xml_diff>
--- a/outputs/tables/Table10_Encompassing.docx
+++ b/outputs/tables/Table10_Encompassing.docx
@@ -330,7 +330,7 @@
                 <w:rFonts w:ascii="Times New Roman" w:hAnsi="Times New Roman"/>
                 <w:sz w:val="20"/>
               </w:rPr>
-              <w:t>GARCH-LSTM vs. ARCH(1)</w:t>
+              <w:t>LSTM-SSE-t-Student vs. ARCH(1)</w:t>
             </w:r>
           </w:p>
         </w:tc>
@@ -514,7 +514,7 @@
                 <w:rFonts w:ascii="Times New Roman" w:hAnsi="Times New Roman"/>
                 <w:sz w:val="20"/>
               </w:rPr>
-              <w:t>GARCH-LSTM vs. GARCH(1,1)</w:t>
+              <w:t>LSTM-SSE-t-Student vs. GARCH(1,1)</w:t>
             </w:r>
           </w:p>
         </w:tc>

</xml_diff>